<commit_message>
Add k9s setup and resync docs
</commit_message>
<xml_diff>
--- a/odigoi/04_remote_spark_kubernetes.docx
+++ b/odigoi/04_remote_spark_kubernetes.docx
@@ -61,7 +61,7 @@
             </w:rPr>
             <w:fldChar w:fldCharType="separate"/>
           </w:r>
-          <w:hyperlink w:anchor="__RefHeading___Toc1648_2712163" w:tooltip="Προτεινόμενες εκδόσεις">
+          <w:hyperlink w:anchor="__RefHeading___Toc1648_1269902459" w:tooltip="Προτεινόμενες εκδόσεις">
             <w:r>
               <w:rPr>
                 <w:rStyle w:val="IndexLink"/>
@@ -82,7 +82,7 @@
             </w:tabs>
             <w:rPr/>
           </w:pPr>
-          <w:hyperlink w:anchor="__RefHeading___Toc1650_2712163" w:tooltip="Τι χρειάζεστε πριν ξεκινήσετε">
+          <w:hyperlink w:anchor="__RefHeading___Toc1650_1269902459" w:tooltip="Τι χρειάζεστε πριν ξεκινήσετε">
             <w:r>
               <w:rPr>
                 <w:rStyle w:val="IndexLink"/>
@@ -103,7 +103,7 @@
             </w:tabs>
             <w:rPr/>
           </w:pPr>
-          <w:hyperlink w:anchor="__RefHeading___Toc1652_2712163" w:tooltip="1. Έλεγχος Java, Spark και Hadoop στο WSL">
+          <w:hyperlink w:anchor="__RefHeading___Toc1652_1269902459" w:tooltip="1. Έλεγχος Java, Spark και Hadoop στο WSL">
             <w:r>
               <w:rPr>
                 <w:rStyle w:val="IndexLink"/>
@@ -124,7 +124,7 @@
             </w:tabs>
             <w:rPr/>
           </w:pPr>
-          <w:hyperlink w:anchor="__RefHeading___Toc1654_2712163" w:tooltip="2. Κοινό αρχείο περιβάλλοντος στο WSL">
+          <w:hyperlink w:anchor="__RefHeading___Toc1654_1269902459" w:tooltip="2. Κοινό αρχείο περιβάλλοντος στο WSL">
             <w:r>
               <w:rPr>
                 <w:rStyle w:val="IndexLink"/>
@@ -145,7 +145,7 @@
             </w:tabs>
             <w:rPr/>
           </w:pPr>
-          <w:hyperlink w:anchor="__RefHeading___Toc1656_2712163" w:tooltip="Ενεργοποίηση του περιβάλλοντος σε κάθε νέο shell">
+          <w:hyperlink w:anchor="__RefHeading___Toc1656_1269902459" w:tooltip="Ενεργοποίηση του περιβάλλοντος σε κάθε νέο shell">
             <w:r>
               <w:rPr>
                 <w:rStyle w:val="IndexLink"/>
@@ -166,7 +166,7 @@
             </w:tabs>
             <w:rPr/>
           </w:pPr>
-          <w:hyperlink w:anchor="__RefHeading___Toc1658_2712163" w:tooltip="3. kubeconfig, kubectl και DNS">
+          <w:hyperlink w:anchor="__RefHeading___Toc1658_1269902459" w:tooltip="3. kubeconfig, kubectl και DNS">
             <w:r>
               <w:rPr>
                 <w:rStyle w:val="IndexLink"/>
@@ -187,7 +187,7 @@
             </w:tabs>
             <w:rPr/>
           </w:pPr>
-          <w:hyperlink w:anchor="__RefHeading___Toc1660_2712163" w:tooltip="4. Ρύθμιση του Hadoop client">
+          <w:hyperlink w:anchor="__RefHeading___Toc1660_1269902459" w:tooltip="4. Ρύθμιση του Hadoop client">
             <w:r>
               <w:rPr>
                 <w:rStyle w:val="IndexLink"/>
@@ -208,7 +208,7 @@
             </w:tabs>
             <w:rPr/>
           </w:pPr>
-          <w:hyperlink w:anchor="__RefHeading___Toc1662_2712163" w:tooltip="5. Προσωπικό spark-defaults.conf">
+          <w:hyperlink w:anchor="__RefHeading___Toc1662_1269902459" w:tooltip="5. Προσωπικό spark-defaults.conf">
             <w:r>
               <w:rPr>
                 <w:rStyle w:val="IndexLink"/>
@@ -229,7 +229,7 @@
             </w:tabs>
             <w:rPr/>
           </w:pPr>
-          <w:hyperlink w:anchor="__RefHeading___Toc1664_2712163" w:tooltip="6. Έλεγχος προσωπικού HDFS χώρου">
+          <w:hyperlink w:anchor="__RefHeading___Toc1664_1269902459" w:tooltip="6. Έλεγχος προσωπικού HDFS χώρου">
             <w:r>
               <w:rPr>
                 <w:rStyle w:val="IndexLink"/>
@@ -250,7 +250,7 @@
             </w:tabs>
             <w:rPr/>
           </w:pPr>
-          <w:hyperlink w:anchor="__RefHeading___Toc1666_2712163" w:tooltip="7. Πρώτο spark-submit">
+          <w:hyperlink w:anchor="__RefHeading___Toc1666_1269902459" w:tooltip="7. Πρώτο spark-submit">
             <w:r>
               <w:rPr>
                 <w:rStyle w:val="IndexLink"/>
@@ -271,7 +271,7 @@
             </w:tabs>
             <w:rPr/>
           </w:pPr>
-          <w:hyperlink w:anchor="__RefHeading___Toc1668_2712163" w:tooltip="8. Παρακολούθηση της εκτέλεσης">
+          <w:hyperlink w:anchor="__RefHeading___Toc1668_1269902459" w:tooltip="8. Παρακολούθηση της εκτέλεσης">
             <w:r>
               <w:rPr>
                 <w:rStyle w:val="IndexLink"/>
@@ -292,7 +292,7 @@
             </w:tabs>
             <w:rPr/>
           </w:pPr>
-          <w:hyperlink w:anchor="__RefHeading___Toc1670_2712163" w:tooltip="Τοπικός History Server για τα απομακρυσμένα logs">
+          <w:hyperlink w:anchor="__RefHeading___Toc1670_1269902459" w:tooltip="Τοπικός History Server για τα απομακρυσμένα logs">
             <w:r>
               <w:rPr>
                 <w:rStyle w:val="IndexLink"/>
@@ -313,7 +313,7 @@
             </w:tabs>
             <w:rPr/>
           </w:pPr>
-          <w:hyperlink w:anchor="__RefHeading___Toc1672_2712163" w:tooltip="Αντιμετώπιση προβλημάτων">
+          <w:hyperlink w:anchor="__RefHeading___Toc1672_1269902459" w:tooltip="Αντιμετώπιση προβλημάτων">
             <w:r>
               <w:rPr>
                 <w:rStyle w:val="IndexLink"/>
@@ -334,7 +334,7 @@
             </w:tabs>
             <w:rPr/>
           </w:pPr>
-          <w:hyperlink w:anchor="__RefHeading___Toc1674_2712163" w:tooltip="Το spark-submit δεν βρίσκει τα paths">
+          <w:hyperlink w:anchor="__RefHeading___Toc1674_1269902459" w:tooltip="Το spark-submit δεν βρίσκει τα paths">
             <w:r>
               <w:rPr>
                 <w:rStyle w:val="IndexLink"/>
@@ -355,7 +355,7 @@
             </w:tabs>
             <w:rPr/>
           </w:pPr>
-          <w:hyperlink w:anchor="__RefHeading___Toc1676_2712163" w:tooltip="Το job έτρεξε τοπικά αντί για Kubernetes">
+          <w:hyperlink w:anchor="__RefHeading___Toc1676_1269902459" w:tooltip="Το job έτρεξε τοπικά αντί για Kubernetes">
             <w:r>
               <w:rPr>
                 <w:rStyle w:val="IndexLink"/>
@@ -376,7 +376,7 @@
             </w:tabs>
             <w:rPr/>
           </w:pPr>
-          <w:hyperlink w:anchor="__RefHeading___Toc1678_2712163" w:tooltip="Λείπει το spark.kubernetes.file.upload.path">
+          <w:hyperlink w:anchor="__RefHeading___Toc1678_1269902459" w:tooltip="Λείπει το spark.kubernetes.file.upload.path">
             <w:r>
               <w:rPr>
                 <w:rStyle w:val="IndexLink"/>
@@ -397,7 +397,7 @@
             </w:tabs>
             <w:rPr/>
           </w:pPr>
-          <w:hyperlink w:anchor="__RefHeading___Toc1680_2712163" w:tooltip="Permission denied στο .spark-upload ή στα logs">
+          <w:hyperlink w:anchor="__RefHeading___Toc1680_1269902459" w:tooltip="Permission denied στο .spark-upload ή στα logs">
             <w:r>
               <w:rPr>
                 <w:rStyle w:val="IndexLink"/>
@@ -418,7 +418,7 @@
             </w:tabs>
             <w:rPr/>
           </w:pPr>
-          <w:hyperlink w:anchor="__RefHeading___Toc1682_2712163" w:tooltip="Τα hostnames δεν επιλύονται από το WSL">
+          <w:hyperlink w:anchor="__RefHeading___Toc1682_1269902459" w:tooltip="Τα hostnames δεν επιλύονται από το WSL">
             <w:r>
               <w:rPr>
                 <w:rStyle w:val="IndexLink"/>
@@ -439,7 +439,7 @@
             </w:tabs>
             <w:rPr/>
           </w:pPr>
-          <w:hyperlink w:anchor="__RefHeading___Toc1684_2712163" w:tooltip="Τι ακολουθεί">
+          <w:hyperlink w:anchor="__RefHeading___Toc1684_1269902459" w:tooltip="Τι ακολουθεί">
             <w:r>
               <w:rPr>
                 <w:rStyle w:val="IndexLink"/>
@@ -898,7 +898,7 @@
               <w:jc w:val="left"/>
               <w:rPr/>
             </w:pPr>
-            <w:bookmarkStart w:id="0" w:name="__RefHeading___Toc1648_2712163"/>
+            <w:bookmarkStart w:id="0" w:name="__RefHeading___Toc1648_1269902459"/>
             <w:bookmarkStart w:id="1" w:name="προτεινόμενες-εκδόσεις"/>
             <w:bookmarkEnd w:id="0"/>
             <w:r>
@@ -1117,7 +1117,7 @@
         <w:pStyle w:val="Heading1"/>
         <w:rPr/>
       </w:pPr>
-      <w:bookmarkStart w:id="2" w:name="__RefHeading___Toc1650_2712163"/>
+      <w:bookmarkStart w:id="2" w:name="__RefHeading___Toc1650_1269902459"/>
       <w:bookmarkStart w:id="3" w:name="τι-χρειάζεστε-πριν-ξεκινήσετε"/>
       <w:bookmarkEnd w:id="2"/>
       <w:r>
@@ -1285,7 +1285,7 @@
         <w:pStyle w:val="Heading1"/>
         <w:rPr/>
       </w:pPr>
-      <w:bookmarkStart w:id="4" w:name="__RefHeading___Toc1652_2712163"/>
+      <w:bookmarkStart w:id="4" w:name="__RefHeading___Toc1652_1269902459"/>
       <w:bookmarkStart w:id="5" w:name="Xf6ed197bb5615c093abcccebdc9cd421d7def80"/>
       <w:bookmarkEnd w:id="4"/>
       <w:r>
@@ -1493,7 +1493,7 @@
         <w:pStyle w:val="Heading1"/>
         <w:rPr/>
       </w:pPr>
-      <w:bookmarkStart w:id="6" w:name="__RefHeading___Toc1654_2712163"/>
+      <w:bookmarkStart w:id="6" w:name="__RefHeading___Toc1654_1269902459"/>
       <w:bookmarkStart w:id="7" w:name="X73cd8c89c86af861047f3198af3facf81798a53"/>
       <w:bookmarkEnd w:id="6"/>
       <w:r>
@@ -3411,7 +3411,7 @@
         <w:rPr>
           <w:rStyle w:val="NormalTok"/>
         </w:rPr>
-        <w:t>SPARK_HISTORY_UI_HOST_PORT=18086</w:t>
+        <w:t>SPARK_HISTORY_UI_HOST_PORT=18081</w:t>
       </w:r>
       <w:r>
         <w:rPr/>
@@ -3544,7 +3544,7 @@
         <w:pStyle w:val="Heading2"/>
         <w:rPr/>
       </w:pPr>
-      <w:bookmarkStart w:id="8" w:name="__RefHeading___Toc1656_2712163"/>
+      <w:bookmarkStart w:id="8" w:name="__RefHeading___Toc1656_1269902459"/>
       <w:bookmarkStart w:id="9" w:name="Xf2461b396d2f66e5cae6b31654ed7817042e538"/>
       <w:bookmarkEnd w:id="8"/>
       <w:r>
@@ -4062,7 +4062,7 @@
         <w:pStyle w:val="Heading1"/>
         <w:rPr/>
       </w:pPr>
-      <w:bookmarkStart w:id="10" w:name="__RefHeading___Toc1658_2712163"/>
+      <w:bookmarkStart w:id="10" w:name="__RefHeading___Toc1658_1269902459"/>
       <w:bookmarkStart w:id="11" w:name="X768724f0ecdae3eda656e9b5d29eeb0fcd0ce9f"/>
       <w:bookmarkEnd w:id="10"/>
       <w:r>
@@ -4300,7 +4300,7 @@
         <w:pStyle w:val="Heading1"/>
         <w:rPr/>
       </w:pPr>
-      <w:bookmarkStart w:id="12" w:name="__RefHeading___Toc1660_2712163"/>
+      <w:bookmarkStart w:id="12" w:name="__RefHeading___Toc1660_1269902459"/>
       <w:bookmarkStart w:id="13" w:name="X7af9bcb5de8c2b68fc10d59bb87981a4d17b9f6"/>
       <w:bookmarkEnd w:id="12"/>
       <w:r>
@@ -4640,7 +4640,7 @@
         <w:pStyle w:val="Heading1"/>
         <w:rPr/>
       </w:pPr>
-      <w:bookmarkStart w:id="14" w:name="__RefHeading___Toc1662_2712163"/>
+      <w:bookmarkStart w:id="14" w:name="__RefHeading___Toc1662_1269902459"/>
       <w:bookmarkStart w:id="15" w:name="X6d23b9fa4ae6e324776e7617d69fae5413f4315"/>
       <w:bookmarkEnd w:id="14"/>
       <w:r>
@@ -5013,7 +5013,7 @@
         <w:pStyle w:val="Heading1"/>
         <w:rPr/>
       </w:pPr>
-      <w:bookmarkStart w:id="16" w:name="__RefHeading___Toc1664_2712163"/>
+      <w:bookmarkStart w:id="16" w:name="__RefHeading___Toc1664_1269902459"/>
       <w:bookmarkStart w:id="17" w:name="X474b439264900bda26b7a8fa29861f265e04b3d"/>
       <w:bookmarkEnd w:id="16"/>
       <w:r>
@@ -5337,7 +5337,7 @@
         <w:pStyle w:val="Heading1"/>
         <w:rPr/>
       </w:pPr>
-      <w:bookmarkStart w:id="18" w:name="__RefHeading___Toc1666_2712163"/>
+      <w:bookmarkStart w:id="18" w:name="__RefHeading___Toc1666_1269902459"/>
       <w:bookmarkStart w:id="19" w:name="X433d3aecd852bfd734749eece289d93d75272dc"/>
       <w:bookmarkEnd w:id="18"/>
       <w:r>
@@ -7935,7 +7935,7 @@
         <w:pStyle w:val="Heading1"/>
         <w:rPr/>
       </w:pPr>
-      <w:bookmarkStart w:id="20" w:name="__RefHeading___Toc1668_2712163"/>
+      <w:bookmarkStart w:id="20" w:name="__RefHeading___Toc1668_1269902459"/>
       <w:bookmarkStart w:id="21" w:name="Xa00a42211ec1a07bcfb2b28b55e5b8e9baff4a4"/>
       <w:bookmarkEnd w:id="20"/>
       <w:r>
@@ -8387,7 +8387,7 @@
         <w:pStyle w:val="Heading2"/>
         <w:rPr/>
       </w:pPr>
-      <w:bookmarkStart w:id="22" w:name="__RefHeading___Toc1670_2712163"/>
+      <w:bookmarkStart w:id="22" w:name="__RefHeading___Toc1670_1269902459"/>
       <w:bookmarkStart w:id="23" w:name="X896ae6defe305a46fdc2c05b366d10f06f756b1"/>
       <w:bookmarkEnd w:id="22"/>
       <w:r>
@@ -8597,7 +8597,7 @@
         <w:pStyle w:val="Heading1"/>
         <w:rPr/>
       </w:pPr>
-      <w:bookmarkStart w:id="24" w:name="__RefHeading___Toc1672_2712163"/>
+      <w:bookmarkStart w:id="24" w:name="__RefHeading___Toc1672_1269902459"/>
       <w:bookmarkStart w:id="25" w:name="αντιμετώπιση-προβλημάτων"/>
       <w:bookmarkEnd w:id="24"/>
       <w:r>
@@ -8611,7 +8611,7 @@
         <w:pStyle w:val="Heading2"/>
         <w:rPr/>
       </w:pPr>
-      <w:bookmarkStart w:id="26" w:name="__RefHeading___Toc1674_2712163"/>
+      <w:bookmarkStart w:id="26" w:name="__RefHeading___Toc1674_1269902459"/>
       <w:bookmarkStart w:id="27" w:name="το-spark-submit-δεν-βρίσκει-τα-paths"/>
       <w:bookmarkEnd w:id="26"/>
       <w:r>
@@ -8767,7 +8767,7 @@
         <w:pStyle w:val="Heading2"/>
         <w:rPr/>
       </w:pPr>
-      <w:bookmarkStart w:id="28" w:name="__RefHeading___Toc1676_2712163"/>
+      <w:bookmarkStart w:id="28" w:name="__RefHeading___Toc1676_1269902459"/>
       <w:bookmarkStart w:id="29" w:name="το-job-έτρεξε-τοπικά-αντί-για-kubernetes"/>
       <w:bookmarkEnd w:id="28"/>
       <w:r>
@@ -8911,7 +8911,7 @@
         <w:pStyle w:val="Heading2"/>
         <w:rPr/>
       </w:pPr>
-      <w:bookmarkStart w:id="30" w:name="__RefHeading___Toc1678_2712163"/>
+      <w:bookmarkStart w:id="30" w:name="__RefHeading___Toc1678_1269902459"/>
       <w:bookmarkStart w:id="31" w:name="λείπει-το-sparkkubernetesfileuploadpath"/>
       <w:bookmarkEnd w:id="30"/>
       <w:r>
@@ -8989,7 +8989,7 @@
         <w:pStyle w:val="Heading2"/>
         <w:rPr/>
       </w:pPr>
-      <w:bookmarkStart w:id="32" w:name="__RefHeading___Toc1680_2712163"/>
+      <w:bookmarkStart w:id="32" w:name="__RefHeading___Toc1680_1269902459"/>
       <w:bookmarkStart w:id="33" w:name="X92de80c4278346e274e1dd3cb2dc6e2c6378564"/>
       <w:bookmarkEnd w:id="32"/>
       <w:r>
@@ -9077,7 +9077,7 @@
         <w:pStyle w:val="Heading2"/>
         <w:rPr/>
       </w:pPr>
-      <w:bookmarkStart w:id="34" w:name="__RefHeading___Toc1682_2712163"/>
+      <w:bookmarkStart w:id="34" w:name="__RefHeading___Toc1682_1269902459"/>
       <w:bookmarkStart w:id="35" w:name="τα-hostnames-δεν-επιλύονται-από-το-wsl"/>
       <w:bookmarkEnd w:id="34"/>
       <w:r>
@@ -9145,7 +9145,7 @@
         <w:pStyle w:val="Heading1"/>
         <w:rPr/>
       </w:pPr>
-      <w:bookmarkStart w:id="36" w:name="__RefHeading___Toc1684_2712163"/>
+      <w:bookmarkStart w:id="36" w:name="__RefHeading___Toc1684_1269902459"/>
       <w:bookmarkStart w:id="37" w:name="τι-ακολουθεί"/>
       <w:bookmarkEnd w:id="36"/>
       <w:r>

</xml_diff>